<commit_message>
Update Lyft CV: add Jira, Canva, Photoshop, and basic programming skills
</commit_message>
<xml_diff>
--- a/cvs/Generated/Lyft - Customer Impact/CV_Valeria_Paez_Reyes_Lyft_-_Customer_Impact.docx
+++ b/cvs/Generated/Lyft - Customer Impact/CV_Valeria_Paez_Reyes_Lyft_-_Customer_Impact.docx
@@ -158,7 +158,7 @@
         <w:spacing w:before="20" w:after="20"/>
       </w:pPr>
       <w:r>
-        <w:t>Documented bug findings clearly and consistently using internal ticketing tools, ensuring engineering received vetted, evidence-backed reports rather than unverified noise</w:t>
+        <w:t>Documented bug findings clearly and consistently using Jira-style ticketing tools, ensuring engineering received vetted, evidence-backed reports rather than unverified noise</w:t>
       </w:r>
     </w:p>
     <w:p>
@@ -588,7 +588,7 @@
         <w:t xml:space="preserve">Customer Support &amp; Triage: </w:t>
       </w:r>
       <w:r>
-        <w:t>Zendesk-style ticketing, bug investigation, issue reproduction, escalation workflows, customer onboarding, retention</w:t>
+        <w:t>Jira, Zendesk-style ticketing, bug investigation, issue reproduction, escalation workflows, customer onboarding, retention</w:t>
       </w:r>
     </w:p>
     <w:p>

</xml_diff>

<commit_message>
Enhance Lyft CV: emphasize hands-on technical work with engineers, Tiendanube overload coverage, SaaS environment context
</commit_message>
<xml_diff>
--- a/cvs/Generated/Lyft - Customer Impact/CV_Valeria_Paez_Reyes_Lyft_-_Customer_Impact.docx
+++ b/cvs/Generated/Lyft - Customer Impact/CV_Valeria_Paez_Reyes_Lyft_-_Customer_Impact.docx
@@ -52,7 +52,7 @@
     </w:p>
     <w:p>
       <w:r>
-        <w:t>Marketing graduate with hands-on experience in customer-facing support roles, UX/UI design, and digital platform troubleshooting. At Tiendanube, I served as the first line of support for merchants, investigating technical issues, reproducing platform bugs, and escalating verified cases to product and engineering teams — turning raw customer signal into actionable tickets. I bring a blended skill set of empathetic customer communication, analytical curiosity, and UX/UI sensibility (Figma, wireframing, prototyping, CRO) that helps me understand both the user frustration and the underlying interface flaw. Comfortable working in fast-paced, ticket-driven environments with structured workflows and high-volume queues. Passionate about solving problems methodically and ensuring no customer issue gets lost in the noise. ---</w:t>
+        <w:t>Marketing graduate with hands-on experience at the intersection of customer support and technical troubleshooting inside SaaS environments. At Tiendanube — an e-commerce platform serving thousands of merchants — I acted as the bridge between users and engineering: reproducing bugs, performing technical diagnostics, and escalating evidence-backed tickets to the product team. I routinely stepped outside the standard support scope to handle technical tasks (store URL/hosting connections, Meta Pixel configuration, third-party integrations) when the dedicated technical support team was overloaded. I bring a blended skill set of empathetic customer communication, analytical curiosity, and UX/UI sensibility (Figma, wireframing, prototyping, CRO) that helps me understand both the user frustration and the underlying interface flaw. Comfortable in fast-paced, ticket-driven environments with structured workflows, high-volume queues, and direct exposure to engineering backlogs. ---</w:t>
       </w:r>
     </w:p>
     <w:p>
@@ -145,72 +145,72 @@
         <w:spacing w:before="20" w:after="20"/>
       </w:pPr>
       <w:r>
-        <w:t>Investigated and triaged incoming merchant-reported issues on the e-commerce platform, verifying reproducibility and impact before escalating to product and engineering teams</w:t>
-      </w:r>
-    </w:p>
-    <w:p>
-      <w:pPr>
-        <w:pStyle w:val="ListParagraph"/>
-        <w:numPr>
-          <w:ilvl w:val="0"/>
-          <w:numId w:val="2"/>
-        </w:numPr>
-        <w:spacing w:before="20" w:after="20"/>
-      </w:pPr>
-      <w:r>
-        <w:t>Documented bug findings clearly and consistently using Jira-style ticketing tools, ensuring engineering received vetted, evidence-backed reports rather than unverified noise</w:t>
-      </w:r>
-    </w:p>
-    <w:p>
-      <w:pPr>
-        <w:pStyle w:val="ListParagraph"/>
-        <w:numPr>
-          <w:ilvl w:val="0"/>
-          <w:numId w:val="2"/>
-        </w:numPr>
-        <w:spacing w:before="20" w:after="20"/>
-      </w:pPr>
-      <w:r>
-        <w:t>Analyzed platform metrics and customer behavior data (Excel, Google Sheets) to identify recurring pain points and patterns, flagging trends to senior specialists for deeper investigation</w:t>
-      </w:r>
-    </w:p>
-    <w:p>
-      <w:pPr>
-        <w:pStyle w:val="ListParagraph"/>
-        <w:numPr>
-          <w:ilvl w:val="0"/>
-          <w:numId w:val="2"/>
-        </w:numPr>
-        <w:spacing w:before="20" w:after="20"/>
-      </w:pPr>
-      <w:r>
-        <w:t>Provided empathetic, warm, and solution-oriented communication to merchants experiencing genuinely frustrating technical issues, often following up on problems that upset them</w:t>
-      </w:r>
-    </w:p>
-    <w:p>
-      <w:pPr>
-        <w:pStyle w:val="ListParagraph"/>
-        <w:numPr>
-          <w:ilvl w:val="0"/>
-          <w:numId w:val="2"/>
-        </w:numPr>
-        <w:spacing w:before="20" w:after="20"/>
-      </w:pPr>
-      <w:r>
-        <w:t>Trained and guided new merchants through platform onboarding, helping them navigate integrations (Meta Ads, Google Ads, GA4, Meta Pixel) and resolve setup friction</w:t>
-      </w:r>
-    </w:p>
-    <w:p>
-      <w:pPr>
-        <w:pStyle w:val="ListParagraph"/>
-        <w:numPr>
-          <w:ilvl w:val="0"/>
-          <w:numId w:val="2"/>
-        </w:numPr>
-        <w:spacing w:before="20" w:after="20"/>
-      </w:pPr>
-      <w:r>
-        <w:t>Collaborated cross-functionally with product, technology, and operations teams to resolve issues and improve the user experience based on frontline feedback</w:t>
+        <w:t>Investigated and triaged incoming merchant-reported issues on the e-commerce platform, reproducing bugs side-by-side with engineers and documenting clear, evidence-backed findings in Jira-style tickets so the product team received vetted signal instead of unverified noise</w:t>
+      </w:r>
+    </w:p>
+    <w:p>
+      <w:pPr>
+        <w:pStyle w:val="ListParagraph"/>
+        <w:numPr>
+          <w:ilvl w:val="0"/>
+          <w:numId w:val="2"/>
+        </w:numPr>
+        <w:spacing w:before="20" w:after="20"/>
+      </w:pPr>
+      <w:r>
+        <w:t>Performed technical setup tasks that fell outside standard support scope — including store URL/hosting connections, Meta Pixel configuration, and third-party app integrations — when the technical support team was overloaded and unable to clear its backlog</w:t>
+      </w:r>
+    </w:p>
+    <w:p>
+      <w:pPr>
+        <w:pStyle w:val="ListParagraph"/>
+        <w:numPr>
+          <w:ilvl w:val="0"/>
+          <w:numId w:val="2"/>
+        </w:numPr>
+        <w:spacing w:before="20" w:after="20"/>
+      </w:pPr>
+      <w:r>
+        <w:t>Analyzed platform metrics and customer behavior data (Excel, Google Sheets) to identify recurring pain points and patterns, flagging systemic issues to senior specialists for deeper investigation</w:t>
+      </w:r>
+    </w:p>
+    <w:p>
+      <w:pPr>
+        <w:pStyle w:val="ListParagraph"/>
+        <w:numPr>
+          <w:ilvl w:val="0"/>
+          <w:numId w:val="2"/>
+        </w:numPr>
+        <w:spacing w:before="20" w:after="20"/>
+      </w:pPr>
+      <w:r>
+        <w:t>Provided empathetic, warm, and solution-oriented communication to merchants experiencing genuinely frustrating technical issues, often following up on problems that upset them until resolution</w:t>
+      </w:r>
+    </w:p>
+    <w:p>
+      <w:pPr>
+        <w:pStyle w:val="ListParagraph"/>
+        <w:numPr>
+          <w:ilvl w:val="0"/>
+          <w:numId w:val="2"/>
+        </w:numPr>
+        <w:spacing w:before="20" w:after="20"/>
+      </w:pPr>
+      <w:r>
+        <w:t>Trained and guided new merchants through platform onboarding, helping them navigate complex technical integrations (Meta Ads, Google Ads, GA4, Meta Pixel) and resolve setup friction autonomously</w:t>
+      </w:r>
+    </w:p>
+    <w:p>
+      <w:pPr>
+        <w:pStyle w:val="ListParagraph"/>
+        <w:numPr>
+          <w:ilvl w:val="0"/>
+          <w:numId w:val="2"/>
+        </w:numPr>
+        <w:spacing w:before="20" w:after="20"/>
+      </w:pPr>
+      <w:r>
+        <w:t>Acted as the frontline feedback loop for product and engineering, translating user complaints into reproducible technical steps and prioritizing escalations based on impact and severity</w:t>
       </w:r>
     </w:p>
     <w:p>
@@ -378,46 +378,46 @@
         <w:spacing w:before="20" w:after="20"/>
       </w:pPr>
       <w:r>
-        <w:t>Optimized landing pages with focus on CRO, UX, and SEO; developed interactive prototypes in Figma to improve conversion flows</w:t>
-      </w:r>
-    </w:p>
-    <w:p>
-      <w:pPr>
-        <w:pStyle w:val="ListParagraph"/>
-        <w:numPr>
-          <w:ilvl w:val="0"/>
-          <w:numId w:val="2"/>
-        </w:numPr>
-        <w:spacing w:before="20" w:after="20"/>
-      </w:pPr>
-      <w:r>
-        <w:t>Managed and segmented Salesforce lead databases for lead generation and nurturing campaigns</w:t>
-      </w:r>
-    </w:p>
-    <w:p>
-      <w:pPr>
-        <w:pStyle w:val="ListParagraph"/>
-        <w:numPr>
-          <w:ilvl w:val="0"/>
-          <w:numId w:val="2"/>
-        </w:numPr>
-        <w:spacing w:before="20" w:after="20"/>
-      </w:pPr>
-      <w:r>
-        <w:t>Conducted competitor analysis, SEM keyword research, and campaign ROI reporting using Excel</w:t>
-      </w:r>
-    </w:p>
-    <w:p>
-      <w:pPr>
-        <w:pStyle w:val="ListParagraph"/>
-        <w:numPr>
-          <w:ilvl w:val="0"/>
-          <w:numId w:val="2"/>
-        </w:numPr>
-        <w:spacing w:before="20" w:after="20"/>
-      </w:pPr>
-      <w:r>
-        <w:t>Created sales enablement and product materials in collaboration with the marketing team</w:t>
+        <w:t>Optimized SaaS landing pages with focus on CRO, UX, and SEO; developed interactive prototypes in Figma to improve conversion flows inside a B2B fleet-management platform</w:t>
+      </w:r>
+    </w:p>
+    <w:p>
+      <w:pPr>
+        <w:pStyle w:val="ListParagraph"/>
+        <w:numPr>
+          <w:ilvl w:val="0"/>
+          <w:numId w:val="2"/>
+        </w:numPr>
+        <w:spacing w:before="20" w:after="20"/>
+      </w:pPr>
+      <w:r>
+        <w:t>Managed and segmented Salesforce lead databases for lead generation and nurturing campaigns in a data-heavy tech environment</w:t>
+      </w:r>
+    </w:p>
+    <w:p>
+      <w:pPr>
+        <w:pStyle w:val="ListParagraph"/>
+        <w:numPr>
+          <w:ilvl w:val="0"/>
+          <w:numId w:val="2"/>
+        </w:numPr>
+        <w:spacing w:before="20" w:after="20"/>
+      </w:pPr>
+      <w:r>
+        <w:t>Conducted competitor analysis, SEM keyword research, and campaign ROI reporting using Excel to support data-driven decisions</w:t>
+      </w:r>
+    </w:p>
+    <w:p>
+      <w:pPr>
+        <w:pStyle w:val="ListParagraph"/>
+        <w:numPr>
+          <w:ilvl w:val="0"/>
+          <w:numId w:val="2"/>
+        </w:numPr>
+        <w:spacing w:before="20" w:after="20"/>
+      </w:pPr>
+      <w:r>
+        <w:t>Created sales enablement and product materials in collaboration with the marketing team, translating complex technical product features into client-friendly assets</w:t>
       </w:r>
     </w:p>
     <w:p>
@@ -588,7 +588,22 @@
         <w:t xml:space="preserve">Customer Support &amp; Triage: </w:t>
       </w:r>
       <w:r>
-        <w:t>Jira, Zendesk-style ticketing, bug investigation, issue reproduction, escalation workflows, customer onboarding, retention</w:t>
+        <w:t>Jira, Zendesk-style ticketing, bug investigation, reproduction, and documentation, escalation workflows, technical onboarding, retention</w:t>
+      </w:r>
+    </w:p>
+    <w:p>
+      <w:pPr>
+        <w:spacing w:before="20" w:after="20"/>
+      </w:pPr>
+      <w:r>
+        <w:rPr>
+          <w:b/>
+          <w:bCs/>
+        </w:rPr>
+        <w:t xml:space="preserve">SaaS &amp; Technical Troubleshooting: </w:t>
+      </w:r>
+      <w:r>
+        <w:t>E-commerce platform support, URL/hosting setup, third-party integrations, API-based tool configuration (Meta Pixel, GA4)</w:t>
       </w:r>
     </w:p>
     <w:p>
@@ -634,21 +649,6 @@
       </w:r>
       <w:r>
         <w:t>Meta Ads, Google Ads, Google Analytics (GA4), Search Console, Meta Pixel, e-commerce platforms</w:t>
-      </w:r>
-    </w:p>
-    <w:p>
-      <w:pPr>
-        <w:spacing w:before="20" w:after="20"/>
-      </w:pPr>
-      <w:r>
-        <w:rPr>
-          <w:b/>
-          <w:bCs/>
-        </w:rPr>
-        <w:t xml:space="preserve">CRM &amp; Automation: </w:t>
-      </w:r>
-      <w:r>
-        <w:t>Salesforce, HubSpot, Mailchimp, Klaviyo</w:t>
       </w:r>
     </w:p>
     <w:p>

</xml_diff>

<commit_message>
Trim Lyft CV to 2 pages: shorter summary, condensed bullets, fewer skills/competencies
</commit_message>
<xml_diff>
--- a/cvs/Generated/Lyft - Customer Impact/CV_Valeria_Paez_Reyes_Lyft_-_Customer_Impact.docx
+++ b/cvs/Generated/Lyft - Customer Impact/CV_Valeria_Paez_Reyes_Lyft_-_Customer_Impact.docx
@@ -52,7 +52,7 @@
     </w:p>
     <w:p>
       <w:r>
-        <w:t>Marketing graduate with hands-on experience at the intersection of customer support and technical troubleshooting inside SaaS environments. At Tiendanube — an e-commerce platform serving thousands of merchants — I acted as the bridge between users and engineering: reproducing bugs, performing technical diagnostics, and escalating evidence-backed tickets to the product team. I routinely stepped outside the standard support scope to handle technical tasks (store URL/hosting connections, Meta Pixel configuration, third-party integrations) when the dedicated technical support team was overloaded. I bring a blended skill set of empathetic customer communication, analytical curiosity, and UX/UI sensibility (Figma, wireframing, prototyping, CRO) that helps me understand both the user frustration and the underlying interface flaw. Comfortable in fast-paced, ticket-driven environments with structured workflows, high-volume queues, and direct exposure to engineering backlogs. ---</w:t>
+        <w:t>Marketing graduate with hands-on experience at the intersection of customer support and technical triage inside SaaS environments. At Tiendanube, I acted as the bridge between users and engineering: reproducing bugs, performing technical diagnostics (URL/hosting setups, Meta Pixel configurations), and escalating evidence-backed tickets when technical support was overloaded. I bring a blended skill set of empathetic communication, UX/UI sensibility (Figma, CRO), and analytical curiosity that helps me understand both user frustration and underlying interface flaws. ---</w:t>
       </w:r>
     </w:p>
     <w:p>
@@ -145,73 +145,71 @@
         <w:spacing w:before="20" w:after="20"/>
       </w:pPr>
       <w:r>
-        <w:t>Investigated and triaged incoming merchant-reported issues on the e-commerce platform, reproducing bugs side-by-side with engineers and documenting clear, evidence-backed findings in Jira-style tickets so the product team received vetted signal instead of unverified noise</w:t>
-      </w:r>
-    </w:p>
-    <w:p>
-      <w:pPr>
-        <w:pStyle w:val="ListParagraph"/>
-        <w:numPr>
-          <w:ilvl w:val="0"/>
-          <w:numId w:val="2"/>
-        </w:numPr>
-        <w:spacing w:before="20" w:after="20"/>
-      </w:pPr>
-      <w:r>
-        <w:t>Performed technical setup tasks that fell outside standard support scope — including store URL/hosting connections, Meta Pixel configuration, and third-party app integrations — when the technical support team was overloaded and unable to clear its backlog</w:t>
-      </w:r>
-    </w:p>
-    <w:p>
-      <w:pPr>
-        <w:pStyle w:val="ListParagraph"/>
-        <w:numPr>
-          <w:ilvl w:val="0"/>
-          <w:numId w:val="2"/>
-        </w:numPr>
-        <w:spacing w:before="20" w:after="20"/>
-      </w:pPr>
-      <w:r>
-        <w:t>Analyzed platform metrics and customer behavior data (Excel, Google Sheets) to identify recurring pain points and patterns, flagging systemic issues to senior specialists for deeper investigation</w:t>
-      </w:r>
-    </w:p>
-    <w:p>
-      <w:pPr>
-        <w:pStyle w:val="ListParagraph"/>
-        <w:numPr>
-          <w:ilvl w:val="0"/>
-          <w:numId w:val="2"/>
-        </w:numPr>
-        <w:spacing w:before="20" w:after="20"/>
-      </w:pPr>
-      <w:r>
-        <w:t>Provided empathetic, warm, and solution-oriented communication to merchants experiencing genuinely frustrating technical issues, often following up on problems that upset them until resolution</w:t>
-      </w:r>
-    </w:p>
-    <w:p>
-      <w:pPr>
-        <w:pStyle w:val="ListParagraph"/>
-        <w:numPr>
-          <w:ilvl w:val="0"/>
-          <w:numId w:val="2"/>
-        </w:numPr>
-        <w:spacing w:before="20" w:after="20"/>
-      </w:pPr>
-      <w:r>
-        <w:t>Trained and guided new merchants through platform onboarding, helping them navigate complex technical integrations (Meta Ads, Google Ads, GA4, Meta Pixel) and resolve setup friction autonomously</w:t>
-      </w:r>
-    </w:p>
-    <w:p>
-      <w:pPr>
-        <w:pStyle w:val="ListParagraph"/>
-        <w:numPr>
-          <w:ilvl w:val="0"/>
-          <w:numId w:val="2"/>
-        </w:numPr>
-        <w:spacing w:before="20" w:after="20"/>
-      </w:pPr>
-      <w:r>
-        <w:t>Acted as the frontline feedback loop for product and engineering, translating user complaints into reproducible technical steps and prioritizing escalations based on impact and severity</w:t>
-      </w:r>
+        <w:t>Investigated and triaged merchant-reported issues, reproducing bugs side-by-side with engineers and documenting findings in Jira-style tickets so the product team received vetted, evidence-backed signal</w:t>
+      </w:r>
+    </w:p>
+    <w:p>
+      <w:pPr>
+        <w:pStyle w:val="ListParagraph"/>
+        <w:numPr>
+          <w:ilvl w:val="0"/>
+          <w:numId w:val="2"/>
+        </w:numPr>
+        <w:spacing w:before="20" w:after="20"/>
+      </w:pPr>
+      <w:r>
+        <w:t>Performed technical setup tasks outside standard support scope — URL/hosting connections, Meta Pixel configuration, third-party integrations — when technical support was overloaded</w:t>
+      </w:r>
+    </w:p>
+    <w:p>
+      <w:pPr>
+        <w:pStyle w:val="ListParagraph"/>
+        <w:numPr>
+          <w:ilvl w:val="0"/>
+          <w:numId w:val="2"/>
+        </w:numPr>
+        <w:spacing w:before="20" w:after="20"/>
+      </w:pPr>
+      <w:r>
+        <w:t>Analyzed platform metrics and customer behavior data (Excel, Google Sheets) to identify recurring pain points and flag systemic trends to senior specialists</w:t>
+      </w:r>
+    </w:p>
+    <w:p>
+      <w:pPr>
+        <w:pStyle w:val="ListParagraph"/>
+        <w:numPr>
+          <w:ilvl w:val="0"/>
+          <w:numId w:val="2"/>
+        </w:numPr>
+        <w:spacing w:before="20" w:after="20"/>
+      </w:pPr>
+      <w:r>
+        <w:t>Provided empathetic, solution-oriented communication to merchants experiencing frustrating technical issues, following up until full resolution</w:t>
+      </w:r>
+    </w:p>
+    <w:p>
+      <w:pPr>
+        <w:pStyle w:val="ListParagraph"/>
+        <w:numPr>
+          <w:ilvl w:val="0"/>
+          <w:numId w:val="2"/>
+        </w:numPr>
+        <w:spacing w:before="20" w:after="20"/>
+      </w:pPr>
+      <w:r>
+        <w:t>Trained new merchants through platform onboarding, guiding them through complex technical integrations (Meta Ads, Google Ads, GA4, Meta Pixel) to resolve friction autonomously</w:t>
+      </w:r>
+    </w:p>
+    <w:p>
+      <w:pPr>
+        <w:pStyle w:val="ListParagraph"/>
+        <w:numPr>
+          <w:ilvl w:val="0"/>
+          <w:numId w:val="2"/>
+        </w:numPr>
+        <w:spacing w:before="20" w:after="20"/>
+      </w:pPr>
+      <w:r/>
     </w:p>
     <w:p>
       <w:pPr>
@@ -295,9 +293,7 @@
         </w:numPr>
         <w:spacing w:before="20" w:after="20"/>
       </w:pPr>
-      <w:r>
-        <w:t>Analyzed content performance data to identify opportunities for improvement in engagement and reach</w:t>
-      </w:r>
+      <w:r/>
     </w:p>
     <w:p>
       <w:pPr>
@@ -404,6 +400,19 @@
         <w:spacing w:before="20" w:after="20"/>
       </w:pPr>
       <w:r>
+        <w:t>Created sales enablement and product materials, translating complex technical product features into client-friendly assets</w:t>
+      </w:r>
+    </w:p>
+    <w:p>
+      <w:pPr>
+        <w:pStyle w:val="ListParagraph"/>
+        <w:numPr>
+          <w:ilvl w:val="0"/>
+          <w:numId w:val="2"/>
+        </w:numPr>
+        <w:spacing w:before="20" w:after="20"/>
+      </w:pPr>
+      <w:r>
         <w:t>Conducted competitor analysis, SEM keyword research, and campaign ROI reporting using Excel to support data-driven decisions</w:t>
       </w:r>
     </w:p>
@@ -416,22 +425,7 @@
         </w:numPr>
         <w:spacing w:before="20" w:after="20"/>
       </w:pPr>
-      <w:r>
-        <w:t>Created sales enablement and product materials in collaboration with the marketing team, translating complex technical product features into client-friendly assets</w:t>
-      </w:r>
-    </w:p>
-    <w:p>
-      <w:pPr>
-        <w:pStyle w:val="ListParagraph"/>
-        <w:numPr>
-          <w:ilvl w:val="0"/>
-          <w:numId w:val="2"/>
-        </w:numPr>
-        <w:spacing w:before="20" w:after="20"/>
-      </w:pPr>
-      <w:r>
-        <w:t>Coordinated event marketing initiatives including partner activations, trade shows, and logistics</w:t>
-      </w:r>
+      <w:r/>
     </w:p>
     <w:p>
       <w:pPr>
@@ -588,7 +582,7 @@
         <w:t xml:space="preserve">Customer Support &amp; Triage: </w:t>
       </w:r>
       <w:r>
-        <w:t>Jira, Zendesk-style ticketing, bug investigation, reproduction, and documentation, escalation workflows, technical onboarding, retention</w:t>
+        <w:t>Jira, Zendesk-style ticketing, bug investigation, reproduction, escalation workflows, technical onboarding, retention</w:t>
       </w:r>
     </w:p>
     <w:p>
@@ -603,7 +597,7 @@
         <w:t xml:space="preserve">SaaS &amp; Technical Troubleshooting: </w:t>
       </w:r>
       <w:r>
-        <w:t>E-commerce platform support, URL/hosting setup, third-party integrations, API-based tool configuration (Meta Pixel, GA4)</w:t>
+        <w:t>E-commerce platform support, URL/hosting setup, third-party integrations, API-based tool configuration (Meta Pixel, GA4), Meta Ads, Google Ads</w:t>
       </w:r>
     </w:p>
     <w:p>
@@ -618,7 +612,7 @@
         <w:t xml:space="preserve">UX/UI &amp; Product Sensibility: </w:t>
       </w:r>
       <w:r>
-        <w:t>Figma, wireframing, prototyping, CRO, landing-page optimization, user-flow analysis, mobile app ecosystems (iOS/Android)</w:t>
+        <w:t>Figma, wireframing, prototyping, CRO, landing-page optimization, user-flow analysis, mobile app ecosystems (iOS/Android), Adobe Photoshop, Canva</w:t>
       </w:r>
     </w:p>
     <w:p>
@@ -645,10 +639,10 @@
           <w:b/>
           <w:bCs/>
         </w:rPr>
-        <w:t xml:space="preserve">Digital Platforms &amp; Integrations: </w:t>
-      </w:r>
-      <w:r>
-        <w:t>Meta Ads, Google Ads, Google Analytics (GA4), Search Console, Meta Pixel, e-commerce platforms</w:t>
+        <w:t xml:space="preserve">CRM &amp; Automation: </w:t>
+      </w:r>
+      <w:r>
+        <w:t>Salesforce, HubSpot, Mailchimp, Klaviyo</w:t>
       </w:r>
     </w:p>
     <w:p>
@@ -729,21 +723,19 @@
         <w:spacing w:before="20" w:after="20"/>
       </w:pPr>
       <w:r>
-        <w:t>Clear cross-functional communication with technical and non-technical teams</w:t>
-      </w:r>
-    </w:p>
-    <w:p>
-      <w:pPr>
-        <w:pStyle w:val="ListParagraph"/>
-        <w:numPr>
-          <w:ilvl w:val="0"/>
-          <w:numId w:val="2"/>
-        </w:numPr>
-        <w:spacing w:before="20" w:after="20"/>
-      </w:pPr>
-      <w:r>
         <w:t>Strong attention to detail and consistent documentation standards</w:t>
       </w:r>
+    </w:p>
+    <w:p>
+      <w:pPr>
+        <w:pStyle w:val="ListParagraph"/>
+        <w:numPr>
+          <w:ilvl w:val="0"/>
+          <w:numId w:val="2"/>
+        </w:numPr>
+        <w:spacing w:before="20" w:after="20"/>
+      </w:pPr>
+      <w:r/>
     </w:p>
     <w:p>
       <w:pPr>

</xml_diff>